<commit_message>
Versión 21-05-2025 lista para hacer primer deploy
</commit_message>
<xml_diff>
--- a/notas importantes.docx
+++ b/notas importantes.docx
@@ -9,7 +9,15 @@
     </w:p>
     <w:p>
       <w:r>
-        <w:t xml:space="preserve">En cmd: </w:t>
+        <w:t xml:space="preserve">En </w:t>
+      </w:r>
+      <w:proofErr w:type="spellStart"/>
+      <w:r>
+        <w:t>cmd</w:t>
+      </w:r>
+      <w:proofErr w:type="spellEnd"/>
+      <w:r>
+        <w:t xml:space="preserve">: </w:t>
       </w:r>
       <w:r>
         <w:t>C:\proyecto_paw_care\Frontend_paw_care</w:t>
@@ -22,17 +30,1214 @@
       </w:r>
     </w:p>
     <w:p>
+      <w:r>
+        <w:t xml:space="preserve">Ejecutar la </w:t>
+      </w:r>
+      <w:proofErr w:type="gramStart"/>
+      <w:r>
+        <w:t>app</w:t>
+      </w:r>
+      <w:proofErr w:type="gramEnd"/>
+      <w:r>
+        <w:t xml:space="preserve">: </w:t>
+      </w:r>
+      <w:proofErr w:type="spellStart"/>
+      <w:r>
+        <w:t>python</w:t>
+      </w:r>
+      <w:proofErr w:type="spellEnd"/>
+      <w:r>
+        <w:t xml:space="preserve"> app.py</w:t>
+      </w:r>
+    </w:p>
+    <w:p/>
+    <w:p>
+      <w:r>
+        <w:t>Debo cancelar CANVAS antes del 09/06</w:t>
+      </w:r>
+    </w:p>
+    <w:p/>
+    <w:p>
+      <w:hyperlink r:id="rId4" w:anchor="tarjetas-de-prueba" w:history="1">
+        <w:r>
+          <w:rPr>
+            <w:rStyle w:val="Hipervnculo"/>
+          </w:rPr>
+          <w:t>•</w:t>
+        </w:r>
+        <w:proofErr w:type="spellStart"/>
+        <w:r>
+          <w:rPr>
+            <w:rStyle w:val="Hipervnculo"/>
+          </w:rPr>
+          <w:t>tbk</w:t>
+        </w:r>
+        <w:proofErr w:type="spellEnd"/>
+        <w:r>
+          <w:rPr>
+            <w:rStyle w:val="Hipervnculo"/>
+          </w:rPr>
+          <w:t>. | DEVELOPERS - Documentación</w:t>
+        </w:r>
+      </w:hyperlink>
+    </w:p>
+    <w:p>
       <w:pPr>
         <w:rPr>
           <w:u w:val="single"/>
         </w:rPr>
       </w:pPr>
       <w:r>
-        <w:t xml:space="preserve">Ejecutar la app: </w:t>
+        <w:rPr>
+          <w:u w:val="single"/>
+        </w:rPr>
+        <w:t>Para las transacciones Webpay en el ambiente de integración se deben usar estas tarjetas de prueba:</w:t>
+      </w:r>
+    </w:p>
+    <w:tbl>
+      <w:tblPr>
+        <w:tblW w:w="0" w:type="auto"/>
+        <w:tblInd w:w="600" w:type="dxa"/>
+        <w:shd w:val="clear" w:color="auto" w:fill="FFFFFF"/>
+        <w:tblCellMar>
+          <w:left w:w="420" w:type="dxa"/>
+          <w:right w:w="420" w:type="dxa"/>
+        </w:tblCellMar>
+        <w:tblLook w:val="04A0" w:firstRow="1" w:lastRow="0" w:firstColumn="1" w:lastColumn="0" w:noHBand="0" w:noVBand="1"/>
+      </w:tblPr>
+      <w:tblGrid>
+        <w:gridCol w:w="1966"/>
+        <w:gridCol w:w="1800"/>
+        <w:gridCol w:w="4472"/>
+      </w:tblGrid>
+      <w:tr>
+        <w:trPr>
+          <w:tblHeader/>
+        </w:trPr>
+        <w:tc>
+          <w:tcPr>
+            <w:tcW w:w="0" w:type="auto"/>
+            <w:tcBorders>
+              <w:bottom w:val="single" w:sz="6" w:space="0" w:color="CCCCCC"/>
+            </w:tcBorders>
+            <w:shd w:val="clear" w:color="auto" w:fill="FFFFFF"/>
+            <w:tcMar>
+              <w:top w:w="75" w:type="dxa"/>
+              <w:left w:w="150" w:type="dxa"/>
+              <w:bottom w:w="75" w:type="dxa"/>
+              <w:right w:w="150" w:type="dxa"/>
+            </w:tcMar>
+            <w:vAlign w:val="bottom"/>
+            <w:hideMark/>
+          </w:tcPr>
+          <w:p>
+            <w:pPr>
+              <w:rPr>
+                <w:b/>
+                <w:bCs/>
+                <w:u w:val="single"/>
+              </w:rPr>
+            </w:pPr>
+            <w:r>
+              <w:rPr>
+                <w:b/>
+                <w:bCs/>
+                <w:u w:val="single"/>
+              </w:rPr>
+              <w:t>Tipo de tarjeta</w:t>
+            </w:r>
+          </w:p>
+        </w:tc>
+        <w:tc>
+          <w:tcPr>
+            <w:tcW w:w="0" w:type="auto"/>
+            <w:tcBorders>
+              <w:bottom w:val="single" w:sz="6" w:space="0" w:color="CCCCCC"/>
+            </w:tcBorders>
+            <w:shd w:val="clear" w:color="auto" w:fill="FFFFFF"/>
+            <w:tcMar>
+              <w:top w:w="75" w:type="dxa"/>
+              <w:left w:w="150" w:type="dxa"/>
+              <w:bottom w:w="75" w:type="dxa"/>
+              <w:right w:w="150" w:type="dxa"/>
+            </w:tcMar>
+            <w:vAlign w:val="bottom"/>
+            <w:hideMark/>
+          </w:tcPr>
+          <w:p>
+            <w:pPr>
+              <w:rPr>
+                <w:b/>
+                <w:bCs/>
+                <w:u w:val="single"/>
+              </w:rPr>
+            </w:pPr>
+            <w:r>
+              <w:rPr>
+                <w:b/>
+                <w:bCs/>
+                <w:u w:val="single"/>
+              </w:rPr>
+              <w:t>Detalle</w:t>
+            </w:r>
+          </w:p>
+        </w:tc>
+        <w:tc>
+          <w:tcPr>
+            <w:tcW w:w="0" w:type="auto"/>
+            <w:tcBorders>
+              <w:bottom w:val="single" w:sz="6" w:space="0" w:color="CCCCCC"/>
+            </w:tcBorders>
+            <w:shd w:val="clear" w:color="auto" w:fill="FFFFFF"/>
+            <w:tcMar>
+              <w:top w:w="75" w:type="dxa"/>
+              <w:left w:w="150" w:type="dxa"/>
+              <w:bottom w:w="75" w:type="dxa"/>
+              <w:right w:w="150" w:type="dxa"/>
+            </w:tcMar>
+            <w:vAlign w:val="bottom"/>
+            <w:hideMark/>
+          </w:tcPr>
+          <w:p>
+            <w:pPr>
+              <w:rPr>
+                <w:b/>
+                <w:bCs/>
+                <w:u w:val="single"/>
+              </w:rPr>
+            </w:pPr>
+            <w:r>
+              <w:rPr>
+                <w:b/>
+                <w:bCs/>
+                <w:u w:val="single"/>
+              </w:rPr>
+              <w:t>Resultado</w:t>
+            </w:r>
+          </w:p>
+        </w:tc>
+      </w:tr>
+      <w:tr>
+        <w:tc>
+          <w:tcPr>
+            <w:tcW w:w="0" w:type="auto"/>
+            <w:tcBorders>
+              <w:top w:val="single" w:sz="6" w:space="0" w:color="E6E6E6"/>
+              <w:left w:val="single" w:sz="6" w:space="0" w:color="E6E6E6"/>
+              <w:bottom w:val="single" w:sz="6" w:space="0" w:color="E6E6E6"/>
+              <w:right w:val="single" w:sz="6" w:space="0" w:color="E6E6E6"/>
+            </w:tcBorders>
+            <w:shd w:val="clear" w:color="auto" w:fill="F9FBFC"/>
+            <w:tcMar>
+              <w:top w:w="150" w:type="dxa"/>
+              <w:left w:w="150" w:type="dxa"/>
+              <w:bottom w:w="150" w:type="dxa"/>
+              <w:right w:w="150" w:type="dxa"/>
+            </w:tcMar>
+            <w:hideMark/>
+          </w:tcPr>
+          <w:p>
+            <w:pPr>
+              <w:rPr>
+                <w:u w:val="single"/>
+              </w:rPr>
+            </w:pPr>
+            <w:r>
+              <w:rPr>
+                <w:u w:val="single"/>
+              </w:rPr>
+              <w:t>VISA</w:t>
+            </w:r>
+          </w:p>
+        </w:tc>
+        <w:tc>
+          <w:tcPr>
+            <w:tcW w:w="0" w:type="auto"/>
+            <w:tcBorders>
+              <w:top w:val="single" w:sz="6" w:space="0" w:color="E6E6E6"/>
+              <w:left w:val="single" w:sz="6" w:space="0" w:color="E6E6E6"/>
+              <w:bottom w:val="single" w:sz="6" w:space="0" w:color="E6E6E6"/>
+              <w:right w:val="single" w:sz="6" w:space="0" w:color="E6E6E6"/>
+            </w:tcBorders>
+            <w:shd w:val="clear" w:color="auto" w:fill="F9FBFC"/>
+            <w:tcMar>
+              <w:top w:w="150" w:type="dxa"/>
+              <w:left w:w="150" w:type="dxa"/>
+              <w:bottom w:w="150" w:type="dxa"/>
+              <w:right w:w="150" w:type="dxa"/>
+            </w:tcMar>
+            <w:hideMark/>
+          </w:tcPr>
+          <w:p>
+            <w:pPr>
+              <w:rPr>
+                <w:u w:val="single"/>
+              </w:rPr>
+            </w:pPr>
+            <w:r>
+              <w:rPr>
+                <w:u w:val="single"/>
+              </w:rPr>
+              <w:t>4051 8856 0044 6623</w:t>
+            </w:r>
+            <w:r>
+              <w:rPr>
+                <w:u w:val="single"/>
+              </w:rPr>
+              <w:br/>
+              <w:t>CVV 123</w:t>
+            </w:r>
+            <w:r>
+              <w:rPr>
+                <w:u w:val="single"/>
+              </w:rPr>
+              <w:br/>
+              <w:t>cualquier fecha de expiración</w:t>
+            </w:r>
+          </w:p>
+        </w:tc>
+        <w:tc>
+          <w:tcPr>
+            <w:tcW w:w="0" w:type="auto"/>
+            <w:tcBorders>
+              <w:top w:val="single" w:sz="6" w:space="0" w:color="E6E6E6"/>
+              <w:left w:val="single" w:sz="6" w:space="0" w:color="E6E6E6"/>
+              <w:bottom w:val="single" w:sz="6" w:space="0" w:color="E6E6E6"/>
+              <w:right w:val="single" w:sz="6" w:space="0" w:color="E6E6E6"/>
+            </w:tcBorders>
+            <w:shd w:val="clear" w:color="auto" w:fill="F9FBFC"/>
+            <w:tcMar>
+              <w:top w:w="150" w:type="dxa"/>
+              <w:left w:w="150" w:type="dxa"/>
+              <w:bottom w:w="150" w:type="dxa"/>
+              <w:right w:w="150" w:type="dxa"/>
+            </w:tcMar>
+            <w:hideMark/>
+          </w:tcPr>
+          <w:p>
+            <w:pPr>
+              <w:rPr>
+                <w:u w:val="single"/>
+              </w:rPr>
+            </w:pPr>
+            <w:r>
+              <w:rPr>
+                <w:u w:val="single"/>
+              </w:rPr>
+              <w:t>Genera transacciones </w:t>
+            </w:r>
+            <w:r>
+              <w:rPr>
+                <w:b/>
+                <w:bCs/>
+                <w:u w:val="single"/>
+              </w:rPr>
+              <w:t>aprobadas</w:t>
+            </w:r>
+            <w:r>
+              <w:rPr>
+                <w:u w:val="single"/>
+              </w:rPr>
+              <w:t>.</w:t>
+            </w:r>
+          </w:p>
+        </w:tc>
+      </w:tr>
+      <w:tr>
+        <w:tc>
+          <w:tcPr>
+            <w:tcW w:w="0" w:type="auto"/>
+            <w:tcBorders>
+              <w:top w:val="single" w:sz="6" w:space="0" w:color="E6E6E6"/>
+              <w:left w:val="single" w:sz="6" w:space="0" w:color="E6E6E6"/>
+              <w:bottom w:val="single" w:sz="6" w:space="0" w:color="E6E6E6"/>
+              <w:right w:val="single" w:sz="6" w:space="0" w:color="E6E6E6"/>
+            </w:tcBorders>
+            <w:shd w:val="clear" w:color="auto" w:fill="F3F7FA"/>
+            <w:tcMar>
+              <w:top w:w="150" w:type="dxa"/>
+              <w:left w:w="150" w:type="dxa"/>
+              <w:bottom w:w="150" w:type="dxa"/>
+              <w:right w:w="150" w:type="dxa"/>
+            </w:tcMar>
+            <w:hideMark/>
+          </w:tcPr>
+          <w:p>
+            <w:pPr>
+              <w:rPr>
+                <w:u w:val="single"/>
+              </w:rPr>
+            </w:pPr>
+            <w:r>
+              <w:rPr>
+                <w:u w:val="single"/>
+              </w:rPr>
+              <w:t>AMEX</w:t>
+            </w:r>
+          </w:p>
+        </w:tc>
+        <w:tc>
+          <w:tcPr>
+            <w:tcW w:w="0" w:type="auto"/>
+            <w:tcBorders>
+              <w:top w:val="single" w:sz="6" w:space="0" w:color="E6E6E6"/>
+              <w:left w:val="single" w:sz="6" w:space="0" w:color="E6E6E6"/>
+              <w:bottom w:val="single" w:sz="6" w:space="0" w:color="E6E6E6"/>
+              <w:right w:val="single" w:sz="6" w:space="0" w:color="E6E6E6"/>
+            </w:tcBorders>
+            <w:shd w:val="clear" w:color="auto" w:fill="F3F7FA"/>
+            <w:tcMar>
+              <w:top w:w="150" w:type="dxa"/>
+              <w:left w:w="150" w:type="dxa"/>
+              <w:bottom w:w="150" w:type="dxa"/>
+              <w:right w:w="150" w:type="dxa"/>
+            </w:tcMar>
+            <w:hideMark/>
+          </w:tcPr>
+          <w:p>
+            <w:pPr>
+              <w:rPr>
+                <w:u w:val="single"/>
+              </w:rPr>
+            </w:pPr>
+            <w:r>
+              <w:rPr>
+                <w:u w:val="single"/>
+              </w:rPr>
+              <w:t>3700 0000 0002 032</w:t>
+            </w:r>
+            <w:r>
+              <w:rPr>
+                <w:u w:val="single"/>
+              </w:rPr>
+              <w:br/>
+              <w:t>CVV 1234</w:t>
+            </w:r>
+            <w:r>
+              <w:rPr>
+                <w:u w:val="single"/>
+              </w:rPr>
+              <w:br/>
+              <w:t>cualquier fecha de expiración</w:t>
+            </w:r>
+          </w:p>
+        </w:tc>
+        <w:tc>
+          <w:tcPr>
+            <w:tcW w:w="0" w:type="auto"/>
+            <w:tcBorders>
+              <w:top w:val="single" w:sz="6" w:space="0" w:color="E6E6E6"/>
+              <w:left w:val="single" w:sz="6" w:space="0" w:color="E6E6E6"/>
+              <w:bottom w:val="single" w:sz="6" w:space="0" w:color="E6E6E6"/>
+              <w:right w:val="single" w:sz="6" w:space="0" w:color="E6E6E6"/>
+            </w:tcBorders>
+            <w:shd w:val="clear" w:color="auto" w:fill="F3F7FA"/>
+            <w:tcMar>
+              <w:top w:w="150" w:type="dxa"/>
+              <w:left w:w="150" w:type="dxa"/>
+              <w:bottom w:w="150" w:type="dxa"/>
+              <w:right w:w="150" w:type="dxa"/>
+            </w:tcMar>
+            <w:hideMark/>
+          </w:tcPr>
+          <w:p>
+            <w:pPr>
+              <w:rPr>
+                <w:u w:val="single"/>
+              </w:rPr>
+            </w:pPr>
+            <w:r>
+              <w:rPr>
+                <w:u w:val="single"/>
+              </w:rPr>
+              <w:t>Genera transacciones </w:t>
+            </w:r>
+            <w:r>
+              <w:rPr>
+                <w:b/>
+                <w:bCs/>
+                <w:u w:val="single"/>
+              </w:rPr>
+              <w:t>aprobadas</w:t>
+            </w:r>
+            <w:r>
+              <w:rPr>
+                <w:u w:val="single"/>
+              </w:rPr>
+              <w:t>.</w:t>
+            </w:r>
+          </w:p>
+        </w:tc>
+      </w:tr>
+      <w:tr>
+        <w:tc>
+          <w:tcPr>
+            <w:tcW w:w="0" w:type="auto"/>
+            <w:tcBorders>
+              <w:top w:val="single" w:sz="6" w:space="0" w:color="E6E6E6"/>
+              <w:left w:val="single" w:sz="6" w:space="0" w:color="E6E6E6"/>
+              <w:bottom w:val="single" w:sz="6" w:space="0" w:color="E6E6E6"/>
+              <w:right w:val="single" w:sz="6" w:space="0" w:color="E6E6E6"/>
+            </w:tcBorders>
+            <w:shd w:val="clear" w:color="auto" w:fill="F9FBFC"/>
+            <w:tcMar>
+              <w:top w:w="150" w:type="dxa"/>
+              <w:left w:w="150" w:type="dxa"/>
+              <w:bottom w:w="150" w:type="dxa"/>
+              <w:right w:w="150" w:type="dxa"/>
+            </w:tcMar>
+            <w:hideMark/>
+          </w:tcPr>
+          <w:p>
+            <w:pPr>
+              <w:rPr>
+                <w:u w:val="single"/>
+              </w:rPr>
+            </w:pPr>
+            <w:r>
+              <w:rPr>
+                <w:u w:val="single"/>
+              </w:rPr>
+              <w:t>MASTERCARD</w:t>
+            </w:r>
+          </w:p>
+        </w:tc>
+        <w:tc>
+          <w:tcPr>
+            <w:tcW w:w="0" w:type="auto"/>
+            <w:tcBorders>
+              <w:top w:val="single" w:sz="6" w:space="0" w:color="E6E6E6"/>
+              <w:left w:val="single" w:sz="6" w:space="0" w:color="E6E6E6"/>
+              <w:bottom w:val="single" w:sz="6" w:space="0" w:color="E6E6E6"/>
+              <w:right w:val="single" w:sz="6" w:space="0" w:color="E6E6E6"/>
+            </w:tcBorders>
+            <w:shd w:val="clear" w:color="auto" w:fill="F9FBFC"/>
+            <w:tcMar>
+              <w:top w:w="150" w:type="dxa"/>
+              <w:left w:w="150" w:type="dxa"/>
+              <w:bottom w:w="150" w:type="dxa"/>
+              <w:right w:w="150" w:type="dxa"/>
+            </w:tcMar>
+            <w:hideMark/>
+          </w:tcPr>
+          <w:p>
+            <w:pPr>
+              <w:rPr>
+                <w:u w:val="single"/>
+              </w:rPr>
+            </w:pPr>
+            <w:r>
+              <w:rPr>
+                <w:u w:val="single"/>
+              </w:rPr>
+              <w:t>5186 0595 5959 0568</w:t>
+            </w:r>
+            <w:r>
+              <w:rPr>
+                <w:u w:val="single"/>
+              </w:rPr>
+              <w:br/>
+              <w:t>CVV 123</w:t>
+            </w:r>
+            <w:r>
+              <w:rPr>
+                <w:u w:val="single"/>
+              </w:rPr>
+              <w:br/>
+              <w:t>cualquier fecha de expiración</w:t>
+            </w:r>
+          </w:p>
+        </w:tc>
+        <w:tc>
+          <w:tcPr>
+            <w:tcW w:w="0" w:type="auto"/>
+            <w:tcBorders>
+              <w:top w:val="single" w:sz="6" w:space="0" w:color="E6E6E6"/>
+              <w:left w:val="single" w:sz="6" w:space="0" w:color="E6E6E6"/>
+              <w:bottom w:val="single" w:sz="6" w:space="0" w:color="E6E6E6"/>
+              <w:right w:val="single" w:sz="6" w:space="0" w:color="E6E6E6"/>
+            </w:tcBorders>
+            <w:shd w:val="clear" w:color="auto" w:fill="F9FBFC"/>
+            <w:tcMar>
+              <w:top w:w="150" w:type="dxa"/>
+              <w:left w:w="150" w:type="dxa"/>
+              <w:bottom w:w="150" w:type="dxa"/>
+              <w:right w:w="150" w:type="dxa"/>
+            </w:tcMar>
+            <w:hideMark/>
+          </w:tcPr>
+          <w:p>
+            <w:pPr>
+              <w:rPr>
+                <w:u w:val="single"/>
+              </w:rPr>
+            </w:pPr>
+            <w:r>
+              <w:rPr>
+                <w:u w:val="single"/>
+              </w:rPr>
+              <w:t>Genera transacciones </w:t>
+            </w:r>
+            <w:r>
+              <w:rPr>
+                <w:b/>
+                <w:bCs/>
+                <w:u w:val="single"/>
+              </w:rPr>
+              <w:t>rechazadas</w:t>
+            </w:r>
+            <w:r>
+              <w:rPr>
+                <w:u w:val="single"/>
+              </w:rPr>
+              <w:t>.</w:t>
+            </w:r>
+          </w:p>
+        </w:tc>
+      </w:tr>
+      <w:tr>
+        <w:tc>
+          <w:tcPr>
+            <w:tcW w:w="0" w:type="auto"/>
+            <w:tcBorders>
+              <w:top w:val="single" w:sz="6" w:space="0" w:color="E6E6E6"/>
+              <w:left w:val="single" w:sz="6" w:space="0" w:color="E6E6E6"/>
+              <w:bottom w:val="single" w:sz="6" w:space="0" w:color="E6E6E6"/>
+              <w:right w:val="single" w:sz="6" w:space="0" w:color="E6E6E6"/>
+            </w:tcBorders>
+            <w:shd w:val="clear" w:color="auto" w:fill="F3F7FA"/>
+            <w:tcMar>
+              <w:top w:w="150" w:type="dxa"/>
+              <w:left w:w="150" w:type="dxa"/>
+              <w:bottom w:w="150" w:type="dxa"/>
+              <w:right w:w="150" w:type="dxa"/>
+            </w:tcMar>
+            <w:hideMark/>
+          </w:tcPr>
+          <w:p>
+            <w:pPr>
+              <w:rPr>
+                <w:u w:val="single"/>
+              </w:rPr>
+            </w:pPr>
+            <w:proofErr w:type="spellStart"/>
+            <w:r>
+              <w:rPr>
+                <w:u w:val="single"/>
+              </w:rPr>
+              <w:lastRenderedPageBreak/>
+              <w:t>Redcompra</w:t>
+            </w:r>
+            <w:proofErr w:type="spellEnd"/>
+          </w:p>
+        </w:tc>
+        <w:tc>
+          <w:tcPr>
+            <w:tcW w:w="0" w:type="auto"/>
+            <w:tcBorders>
+              <w:top w:val="single" w:sz="6" w:space="0" w:color="E6E6E6"/>
+              <w:left w:val="single" w:sz="6" w:space="0" w:color="E6E6E6"/>
+              <w:bottom w:val="single" w:sz="6" w:space="0" w:color="E6E6E6"/>
+              <w:right w:val="single" w:sz="6" w:space="0" w:color="E6E6E6"/>
+            </w:tcBorders>
+            <w:shd w:val="clear" w:color="auto" w:fill="F3F7FA"/>
+            <w:tcMar>
+              <w:top w:w="150" w:type="dxa"/>
+              <w:left w:w="150" w:type="dxa"/>
+              <w:bottom w:w="150" w:type="dxa"/>
+              <w:right w:w="150" w:type="dxa"/>
+            </w:tcMar>
+            <w:hideMark/>
+          </w:tcPr>
+          <w:p>
+            <w:pPr>
+              <w:rPr>
+                <w:u w:val="single"/>
+              </w:rPr>
+            </w:pPr>
+            <w:r>
+              <w:rPr>
+                <w:u w:val="single"/>
+              </w:rPr>
+              <w:t>4051 8842 3993 7763</w:t>
+            </w:r>
+          </w:p>
+        </w:tc>
+        <w:tc>
+          <w:tcPr>
+            <w:tcW w:w="0" w:type="auto"/>
+            <w:tcBorders>
+              <w:top w:val="single" w:sz="6" w:space="0" w:color="E6E6E6"/>
+              <w:left w:val="single" w:sz="6" w:space="0" w:color="E6E6E6"/>
+              <w:bottom w:val="single" w:sz="6" w:space="0" w:color="E6E6E6"/>
+              <w:right w:val="single" w:sz="6" w:space="0" w:color="E6E6E6"/>
+            </w:tcBorders>
+            <w:shd w:val="clear" w:color="auto" w:fill="F3F7FA"/>
+            <w:tcMar>
+              <w:top w:w="150" w:type="dxa"/>
+              <w:left w:w="150" w:type="dxa"/>
+              <w:bottom w:w="150" w:type="dxa"/>
+              <w:right w:w="150" w:type="dxa"/>
+            </w:tcMar>
+            <w:hideMark/>
+          </w:tcPr>
+          <w:p>
+            <w:pPr>
+              <w:rPr>
+                <w:u w:val="single"/>
+              </w:rPr>
+            </w:pPr>
+            <w:r>
+              <w:rPr>
+                <w:u w:val="single"/>
+              </w:rPr>
+              <w:t xml:space="preserve">Genera transacciones aprobadas (para operaciones que permiten débito </w:t>
+            </w:r>
+            <w:proofErr w:type="spellStart"/>
+            <w:r>
+              <w:rPr>
+                <w:u w:val="single"/>
+              </w:rPr>
+              <w:t>Redcompra</w:t>
+            </w:r>
+            <w:proofErr w:type="spellEnd"/>
+            <w:r>
+              <w:rPr>
+                <w:u w:val="single"/>
+              </w:rPr>
+              <w:t>)</w:t>
+            </w:r>
+          </w:p>
+        </w:tc>
+      </w:tr>
+      <w:tr>
+        <w:tc>
+          <w:tcPr>
+            <w:tcW w:w="0" w:type="auto"/>
+            <w:tcBorders>
+              <w:top w:val="single" w:sz="6" w:space="0" w:color="E6E6E6"/>
+              <w:left w:val="single" w:sz="6" w:space="0" w:color="E6E6E6"/>
+              <w:bottom w:val="single" w:sz="6" w:space="0" w:color="E6E6E6"/>
+              <w:right w:val="single" w:sz="6" w:space="0" w:color="E6E6E6"/>
+            </w:tcBorders>
+            <w:shd w:val="clear" w:color="auto" w:fill="F9FBFC"/>
+            <w:tcMar>
+              <w:top w:w="150" w:type="dxa"/>
+              <w:left w:w="150" w:type="dxa"/>
+              <w:bottom w:w="150" w:type="dxa"/>
+              <w:right w:w="150" w:type="dxa"/>
+            </w:tcMar>
+            <w:hideMark/>
+          </w:tcPr>
+          <w:p>
+            <w:pPr>
+              <w:rPr>
+                <w:u w:val="single"/>
+              </w:rPr>
+            </w:pPr>
+            <w:proofErr w:type="spellStart"/>
+            <w:r>
+              <w:rPr>
+                <w:u w:val="single"/>
+              </w:rPr>
+              <w:t>Redcompra</w:t>
+            </w:r>
+            <w:proofErr w:type="spellEnd"/>
+          </w:p>
+        </w:tc>
+        <w:tc>
+          <w:tcPr>
+            <w:tcW w:w="0" w:type="auto"/>
+            <w:tcBorders>
+              <w:top w:val="single" w:sz="6" w:space="0" w:color="E6E6E6"/>
+              <w:left w:val="single" w:sz="6" w:space="0" w:color="E6E6E6"/>
+              <w:bottom w:val="single" w:sz="6" w:space="0" w:color="E6E6E6"/>
+              <w:right w:val="single" w:sz="6" w:space="0" w:color="E6E6E6"/>
+            </w:tcBorders>
+            <w:shd w:val="clear" w:color="auto" w:fill="F9FBFC"/>
+            <w:tcMar>
+              <w:top w:w="150" w:type="dxa"/>
+              <w:left w:w="150" w:type="dxa"/>
+              <w:bottom w:w="150" w:type="dxa"/>
+              <w:right w:w="150" w:type="dxa"/>
+            </w:tcMar>
+            <w:hideMark/>
+          </w:tcPr>
+          <w:p>
+            <w:pPr>
+              <w:rPr>
+                <w:u w:val="single"/>
+              </w:rPr>
+            </w:pPr>
+            <w:r>
+              <w:rPr>
+                <w:u w:val="single"/>
+              </w:rPr>
+              <w:t>4511 3466 6003 7060</w:t>
+            </w:r>
+          </w:p>
+        </w:tc>
+        <w:tc>
+          <w:tcPr>
+            <w:tcW w:w="0" w:type="auto"/>
+            <w:tcBorders>
+              <w:top w:val="single" w:sz="6" w:space="0" w:color="E6E6E6"/>
+              <w:left w:val="single" w:sz="6" w:space="0" w:color="E6E6E6"/>
+              <w:bottom w:val="single" w:sz="6" w:space="0" w:color="E6E6E6"/>
+              <w:right w:val="single" w:sz="6" w:space="0" w:color="E6E6E6"/>
+            </w:tcBorders>
+            <w:shd w:val="clear" w:color="auto" w:fill="F9FBFC"/>
+            <w:tcMar>
+              <w:top w:w="150" w:type="dxa"/>
+              <w:left w:w="150" w:type="dxa"/>
+              <w:bottom w:w="150" w:type="dxa"/>
+              <w:right w:w="150" w:type="dxa"/>
+            </w:tcMar>
+            <w:hideMark/>
+          </w:tcPr>
+          <w:p>
+            <w:pPr>
+              <w:rPr>
+                <w:u w:val="single"/>
+              </w:rPr>
+            </w:pPr>
+            <w:r>
+              <w:rPr>
+                <w:u w:val="single"/>
+              </w:rPr>
+              <w:t xml:space="preserve">Genera transacciones aprobadas (para operaciones que permiten débito </w:t>
+            </w:r>
+            <w:proofErr w:type="spellStart"/>
+            <w:r>
+              <w:rPr>
+                <w:u w:val="single"/>
+              </w:rPr>
+              <w:t>Redcompra</w:t>
+            </w:r>
+            <w:proofErr w:type="spellEnd"/>
+            <w:r>
+              <w:rPr>
+                <w:u w:val="single"/>
+              </w:rPr>
+              <w:t>)</w:t>
+            </w:r>
+          </w:p>
+        </w:tc>
+      </w:tr>
+      <w:tr>
+        <w:tc>
+          <w:tcPr>
+            <w:tcW w:w="0" w:type="auto"/>
+            <w:tcBorders>
+              <w:top w:val="single" w:sz="6" w:space="0" w:color="E6E6E6"/>
+              <w:left w:val="single" w:sz="6" w:space="0" w:color="E6E6E6"/>
+              <w:bottom w:val="single" w:sz="6" w:space="0" w:color="E6E6E6"/>
+              <w:right w:val="single" w:sz="6" w:space="0" w:color="E6E6E6"/>
+            </w:tcBorders>
+            <w:shd w:val="clear" w:color="auto" w:fill="F3F7FA"/>
+            <w:tcMar>
+              <w:top w:w="150" w:type="dxa"/>
+              <w:left w:w="150" w:type="dxa"/>
+              <w:bottom w:w="150" w:type="dxa"/>
+              <w:right w:w="150" w:type="dxa"/>
+            </w:tcMar>
+            <w:hideMark/>
+          </w:tcPr>
+          <w:p>
+            <w:pPr>
+              <w:rPr>
+                <w:u w:val="single"/>
+              </w:rPr>
+            </w:pPr>
+            <w:proofErr w:type="spellStart"/>
+            <w:r>
+              <w:rPr>
+                <w:u w:val="single"/>
+              </w:rPr>
+              <w:t>Redcompra</w:t>
+            </w:r>
+            <w:proofErr w:type="spellEnd"/>
+          </w:p>
+        </w:tc>
+        <w:tc>
+          <w:tcPr>
+            <w:tcW w:w="0" w:type="auto"/>
+            <w:tcBorders>
+              <w:top w:val="single" w:sz="6" w:space="0" w:color="E6E6E6"/>
+              <w:left w:val="single" w:sz="6" w:space="0" w:color="E6E6E6"/>
+              <w:bottom w:val="single" w:sz="6" w:space="0" w:color="E6E6E6"/>
+              <w:right w:val="single" w:sz="6" w:space="0" w:color="E6E6E6"/>
+            </w:tcBorders>
+            <w:shd w:val="clear" w:color="auto" w:fill="F3F7FA"/>
+            <w:tcMar>
+              <w:top w:w="150" w:type="dxa"/>
+              <w:left w:w="150" w:type="dxa"/>
+              <w:bottom w:w="150" w:type="dxa"/>
+              <w:right w:w="150" w:type="dxa"/>
+            </w:tcMar>
+            <w:hideMark/>
+          </w:tcPr>
+          <w:p>
+            <w:pPr>
+              <w:rPr>
+                <w:u w:val="single"/>
+              </w:rPr>
+            </w:pPr>
+            <w:r>
+              <w:rPr>
+                <w:u w:val="single"/>
+              </w:rPr>
+              <w:t>5186 0085 4123 3829</w:t>
+            </w:r>
+          </w:p>
+        </w:tc>
+        <w:tc>
+          <w:tcPr>
+            <w:tcW w:w="0" w:type="auto"/>
+            <w:tcBorders>
+              <w:top w:val="single" w:sz="6" w:space="0" w:color="E6E6E6"/>
+              <w:left w:val="single" w:sz="6" w:space="0" w:color="E6E6E6"/>
+              <w:bottom w:val="single" w:sz="6" w:space="0" w:color="E6E6E6"/>
+              <w:right w:val="single" w:sz="6" w:space="0" w:color="E6E6E6"/>
+            </w:tcBorders>
+            <w:shd w:val="clear" w:color="auto" w:fill="F3F7FA"/>
+            <w:tcMar>
+              <w:top w:w="150" w:type="dxa"/>
+              <w:left w:w="150" w:type="dxa"/>
+              <w:bottom w:w="150" w:type="dxa"/>
+              <w:right w:w="150" w:type="dxa"/>
+            </w:tcMar>
+            <w:hideMark/>
+          </w:tcPr>
+          <w:p>
+            <w:pPr>
+              <w:rPr>
+                <w:u w:val="single"/>
+              </w:rPr>
+            </w:pPr>
+            <w:r>
+              <w:rPr>
+                <w:u w:val="single"/>
+              </w:rPr>
+              <w:t xml:space="preserve">Genera transacciones rechazadas (para operaciones que permiten débito </w:t>
+            </w:r>
+            <w:proofErr w:type="spellStart"/>
+            <w:r>
+              <w:rPr>
+                <w:u w:val="single"/>
+              </w:rPr>
+              <w:t>Redcompra</w:t>
+            </w:r>
+            <w:proofErr w:type="spellEnd"/>
+            <w:r>
+              <w:rPr>
+                <w:u w:val="single"/>
+              </w:rPr>
+              <w:t>)</w:t>
+            </w:r>
+          </w:p>
+        </w:tc>
+      </w:tr>
+      <w:tr>
+        <w:tc>
+          <w:tcPr>
+            <w:tcW w:w="0" w:type="auto"/>
+            <w:tcBorders>
+              <w:top w:val="single" w:sz="6" w:space="0" w:color="E6E6E6"/>
+              <w:left w:val="single" w:sz="6" w:space="0" w:color="E6E6E6"/>
+              <w:bottom w:val="single" w:sz="6" w:space="0" w:color="E6E6E6"/>
+              <w:right w:val="single" w:sz="6" w:space="0" w:color="E6E6E6"/>
+            </w:tcBorders>
+            <w:shd w:val="clear" w:color="auto" w:fill="F9FBFC"/>
+            <w:tcMar>
+              <w:top w:w="150" w:type="dxa"/>
+              <w:left w:w="150" w:type="dxa"/>
+              <w:bottom w:w="150" w:type="dxa"/>
+              <w:right w:w="150" w:type="dxa"/>
+            </w:tcMar>
+            <w:hideMark/>
+          </w:tcPr>
+          <w:p>
+            <w:pPr>
+              <w:rPr>
+                <w:u w:val="single"/>
+              </w:rPr>
+            </w:pPr>
+            <w:r>
+              <w:rPr>
+                <w:u w:val="single"/>
+              </w:rPr>
+              <w:t>Prepago VISA</w:t>
+            </w:r>
+          </w:p>
+        </w:tc>
+        <w:tc>
+          <w:tcPr>
+            <w:tcW w:w="0" w:type="auto"/>
+            <w:tcBorders>
+              <w:top w:val="single" w:sz="6" w:space="0" w:color="E6E6E6"/>
+              <w:left w:val="single" w:sz="6" w:space="0" w:color="E6E6E6"/>
+              <w:bottom w:val="single" w:sz="6" w:space="0" w:color="E6E6E6"/>
+              <w:right w:val="single" w:sz="6" w:space="0" w:color="E6E6E6"/>
+            </w:tcBorders>
+            <w:shd w:val="clear" w:color="auto" w:fill="F9FBFC"/>
+            <w:tcMar>
+              <w:top w:w="150" w:type="dxa"/>
+              <w:left w:w="150" w:type="dxa"/>
+              <w:bottom w:w="150" w:type="dxa"/>
+              <w:right w:w="150" w:type="dxa"/>
+            </w:tcMar>
+            <w:hideMark/>
+          </w:tcPr>
+          <w:p>
+            <w:pPr>
+              <w:rPr>
+                <w:u w:val="single"/>
+              </w:rPr>
+            </w:pPr>
+            <w:r>
+              <w:rPr>
+                <w:u w:val="single"/>
+              </w:rPr>
+              <w:t>4051 8860 0005 6590</w:t>
+            </w:r>
+            <w:r>
+              <w:rPr>
+                <w:u w:val="single"/>
+              </w:rPr>
+              <w:br/>
+              <w:t>CVV 123</w:t>
+            </w:r>
+            <w:r>
+              <w:rPr>
+                <w:u w:val="single"/>
+              </w:rPr>
+              <w:br/>
+              <w:t>cualquier fecha de expiración</w:t>
+            </w:r>
+          </w:p>
+        </w:tc>
+        <w:tc>
+          <w:tcPr>
+            <w:tcW w:w="0" w:type="auto"/>
+            <w:tcBorders>
+              <w:top w:val="single" w:sz="6" w:space="0" w:color="E6E6E6"/>
+              <w:left w:val="single" w:sz="6" w:space="0" w:color="E6E6E6"/>
+              <w:bottom w:val="single" w:sz="6" w:space="0" w:color="E6E6E6"/>
+              <w:right w:val="single" w:sz="6" w:space="0" w:color="E6E6E6"/>
+            </w:tcBorders>
+            <w:shd w:val="clear" w:color="auto" w:fill="F9FBFC"/>
+            <w:tcMar>
+              <w:top w:w="150" w:type="dxa"/>
+              <w:left w:w="150" w:type="dxa"/>
+              <w:bottom w:w="150" w:type="dxa"/>
+              <w:right w:w="150" w:type="dxa"/>
+            </w:tcMar>
+            <w:hideMark/>
+          </w:tcPr>
+          <w:p>
+            <w:pPr>
+              <w:rPr>
+                <w:u w:val="single"/>
+              </w:rPr>
+            </w:pPr>
+            <w:r>
+              <w:rPr>
+                <w:u w:val="single"/>
+              </w:rPr>
+              <w:t>Genera transacciones </w:t>
+            </w:r>
+            <w:r>
+              <w:rPr>
+                <w:b/>
+                <w:bCs/>
+                <w:u w:val="single"/>
+              </w:rPr>
+              <w:t>aprobadas</w:t>
+            </w:r>
+            <w:r>
+              <w:rPr>
+                <w:u w:val="single"/>
+              </w:rPr>
+              <w:t>.</w:t>
+            </w:r>
+          </w:p>
+        </w:tc>
+      </w:tr>
+      <w:tr>
+        <w:tc>
+          <w:tcPr>
+            <w:tcW w:w="0" w:type="auto"/>
+            <w:tcBorders>
+              <w:top w:val="single" w:sz="6" w:space="0" w:color="E6E6E6"/>
+              <w:left w:val="single" w:sz="6" w:space="0" w:color="E6E6E6"/>
+              <w:bottom w:val="single" w:sz="6" w:space="0" w:color="E6E6E6"/>
+              <w:right w:val="single" w:sz="6" w:space="0" w:color="E6E6E6"/>
+            </w:tcBorders>
+            <w:shd w:val="clear" w:color="auto" w:fill="F3F7FA"/>
+            <w:tcMar>
+              <w:top w:w="150" w:type="dxa"/>
+              <w:left w:w="150" w:type="dxa"/>
+              <w:bottom w:w="150" w:type="dxa"/>
+              <w:right w:w="150" w:type="dxa"/>
+            </w:tcMar>
+            <w:hideMark/>
+          </w:tcPr>
+          <w:p>
+            <w:pPr>
+              <w:rPr>
+                <w:u w:val="single"/>
+              </w:rPr>
+            </w:pPr>
+            <w:r>
+              <w:rPr>
+                <w:u w:val="single"/>
+              </w:rPr>
+              <w:t>Prepago MASTERCARD</w:t>
+            </w:r>
+          </w:p>
+        </w:tc>
+        <w:tc>
+          <w:tcPr>
+            <w:tcW w:w="0" w:type="auto"/>
+            <w:tcBorders>
+              <w:top w:val="single" w:sz="6" w:space="0" w:color="E6E6E6"/>
+              <w:left w:val="single" w:sz="6" w:space="0" w:color="E6E6E6"/>
+              <w:bottom w:val="single" w:sz="6" w:space="0" w:color="E6E6E6"/>
+              <w:right w:val="single" w:sz="6" w:space="0" w:color="E6E6E6"/>
+            </w:tcBorders>
+            <w:shd w:val="clear" w:color="auto" w:fill="F3F7FA"/>
+            <w:tcMar>
+              <w:top w:w="150" w:type="dxa"/>
+              <w:left w:w="150" w:type="dxa"/>
+              <w:bottom w:w="150" w:type="dxa"/>
+              <w:right w:w="150" w:type="dxa"/>
+            </w:tcMar>
+            <w:hideMark/>
+          </w:tcPr>
+          <w:p>
+            <w:pPr>
+              <w:rPr>
+                <w:u w:val="single"/>
+              </w:rPr>
+            </w:pPr>
+            <w:r>
+              <w:rPr>
+                <w:u w:val="single"/>
+              </w:rPr>
+              <w:t>5186 1741 1062 9480</w:t>
+            </w:r>
+            <w:r>
+              <w:rPr>
+                <w:u w:val="single"/>
+              </w:rPr>
+              <w:br/>
+              <w:t>CVV 123</w:t>
+            </w:r>
+            <w:r>
+              <w:rPr>
+                <w:u w:val="single"/>
+              </w:rPr>
+              <w:br/>
+              <w:t>cualquier fecha de expiración</w:t>
+            </w:r>
+          </w:p>
+        </w:tc>
+        <w:tc>
+          <w:tcPr>
+            <w:tcW w:w="0" w:type="auto"/>
+            <w:tcBorders>
+              <w:top w:val="single" w:sz="6" w:space="0" w:color="E6E6E6"/>
+              <w:left w:val="single" w:sz="6" w:space="0" w:color="E6E6E6"/>
+              <w:bottom w:val="single" w:sz="6" w:space="0" w:color="E6E6E6"/>
+              <w:right w:val="single" w:sz="6" w:space="0" w:color="E6E6E6"/>
+            </w:tcBorders>
+            <w:shd w:val="clear" w:color="auto" w:fill="F3F7FA"/>
+            <w:tcMar>
+              <w:top w:w="150" w:type="dxa"/>
+              <w:left w:w="150" w:type="dxa"/>
+              <w:bottom w:w="150" w:type="dxa"/>
+              <w:right w:w="150" w:type="dxa"/>
+            </w:tcMar>
+            <w:hideMark/>
+          </w:tcPr>
+          <w:p>
+            <w:pPr>
+              <w:rPr>
+                <w:u w:val="single"/>
+              </w:rPr>
+            </w:pPr>
+            <w:r>
+              <w:rPr>
+                <w:u w:val="single"/>
+              </w:rPr>
+              <w:t>Genera transacciones </w:t>
+            </w:r>
+            <w:r>
+              <w:rPr>
+                <w:b/>
+                <w:bCs/>
+                <w:u w:val="single"/>
+              </w:rPr>
+              <w:t>rechazadas</w:t>
+            </w:r>
+            <w:r>
+              <w:rPr>
+                <w:u w:val="single"/>
+              </w:rPr>
+              <w:t>.</w:t>
+            </w:r>
+          </w:p>
+        </w:tc>
+      </w:tr>
+    </w:tbl>
+    <w:p>
+      <w:pPr>
+        <w:rPr>
+          <w:u w:val="single"/>
+        </w:rPr>
+      </w:pPr>
+      <w:r>
+        <w:rPr>
+          <w:u w:val="single"/>
+        </w:rPr>
+        <w:t>Cuando aparece un formulario de autenticación con RUT y clave, se debe usar el RUT </w:t>
       </w:r>
       <w:r>
-        <w:t>python app.py</w:t>
+        <w:rPr>
+          <w:b/>
+          <w:bCs/>
+          <w:u w:val="single"/>
+        </w:rPr>
+        <w:t>11.111.111-1</w:t>
       </w:r>
+      <w:r>
+        <w:rPr>
+          <w:u w:val="single"/>
+        </w:rPr>
+        <w:t> y la clave </w:t>
+      </w:r>
+      <w:r>
+        <w:rPr>
+          <w:b/>
+          <w:bCs/>
+          <w:u w:val="single"/>
+        </w:rPr>
+        <w:t>123</w:t>
+      </w:r>
+      <w:r>
+        <w:rPr>
+          <w:u w:val="single"/>
+        </w:rPr>
+        <w:t>.</w:t>
+      </w:r>
+    </w:p>
+    <w:p>
+      <w:pPr>
+        <w:rPr>
+          <w:u w:val="single"/>
+        </w:rPr>
+      </w:pPr>
     </w:p>
     <w:p/>
     <w:sectPr>
@@ -648,7 +1853,6 @@
   <w:style w:type="character" w:default="1" w:styleId="Fuentedeprrafopredeter">
     <w:name w:val="Default Paragraph Font"/>
     <w:uiPriority w:val="1"/>
-    <w:semiHidden/>
     <w:unhideWhenUsed/>
   </w:style>
   <w:style w:type="table" w:default="1" w:styleId="Tablanormal">
@@ -960,6 +2164,29 @@
       <w:smallCaps/>
       <w:color w:val="0F4761" w:themeColor="accent1" w:themeShade="BF"/>
       <w:spacing w:val="5"/>
+    </w:rPr>
+  </w:style>
+  <w:style w:type="character" w:styleId="Hipervnculo">
+    <w:name w:val="Hyperlink"/>
+    <w:basedOn w:val="Fuentedeprrafopredeter"/>
+    <w:uiPriority w:val="99"/>
+    <w:unhideWhenUsed/>
+    <w:rsid w:val="007B11FF"/>
+    <w:rPr>
+      <w:color w:val="467886" w:themeColor="hyperlink"/>
+      <w:u w:val="single"/>
+    </w:rPr>
+  </w:style>
+  <w:style w:type="character" w:styleId="Mencinsinresolver">
+    <w:name w:val="Unresolved Mention"/>
+    <w:basedOn w:val="Fuentedeprrafopredeter"/>
+    <w:uiPriority w:val="99"/>
+    <w:semiHidden/>
+    <w:unhideWhenUsed/>
+    <w:rsid w:val="007B11FF"/>
+    <w:rPr>
+      <w:color w:val="605E5C"/>
+      <w:shd w:val="clear" w:color="auto" w:fill="E1DFDD"/>
     </w:rPr>
   </w:style>
 </w:styles>

</xml_diff>

<commit_message>
Agrega nuevo sistema de reservas y de correo con Flask-Mail y plantilla HTML
</commit_message>
<xml_diff>
--- a/notas importantes.docx
+++ b/notas importantes.docx
@@ -2,6 +2,12 @@
 <file path=word/document.xml><?xml version="1.0" encoding="utf-8"?>
 <w:document xmlns:wpc="http://schemas.microsoft.com/office/word/2010/wordprocessingCanvas" xmlns:cx="http://schemas.microsoft.com/office/drawing/2014/chartex" xmlns:cx1="http://schemas.microsoft.com/office/drawing/2015/9/8/chartex" xmlns:cx2="http://schemas.microsoft.com/office/drawing/2015/10/21/chartex" xmlns:cx3="http://schemas.microsoft.com/office/drawing/2016/5/9/chartex" xmlns:cx4="http://schemas.microsoft.com/office/drawing/2016/5/10/chartex" xmlns:cx5="http://schemas.microsoft.com/office/drawing/2016/5/11/chartex" xmlns:cx6="http://schemas.microsoft.com/office/drawing/2016/5/12/chartex" xmlns:cx7="http://schemas.microsoft.com/office/drawing/2016/5/13/chartex" xmlns:cx8="http://schemas.microsoft.com/office/drawing/2016/5/14/chartex" xmlns:mc="http://schemas.openxmlformats.org/markup-compatibility/2006" xmlns:aink="http://schemas.microsoft.com/office/drawing/2016/ink" xmlns:am3d="http://schemas.microsoft.com/office/drawing/2017/model3d" xmlns:o="urn:schemas-microsoft-com:office:office" xmlns:oel="http://schemas.microsoft.com/office/2019/extlst" xmlns:r="http://schemas.openxmlformats.org/officeDocument/2006/relationships" xmlns:m="http://schemas.openxmlformats.org/officeDocument/2006/math" xmlns:v="urn:schemas-microsoft-com:vml" xmlns:wp14="http://schemas.microsoft.com/office/word/2010/wordprocessingDrawing" xmlns:wp="http://schemas.openxmlformats.org/drawingml/2006/wordprocessingDrawing" xmlns:w10="urn:schemas-microsoft-com:office:word" xmlns:w="http://schemas.openxmlformats.org/wordprocessingml/2006/main" xmlns:w14="http://schemas.microsoft.com/office/word/2010/wordml" xmlns:w15="http://schemas.microsoft.com/office/word/2012/wordml" xmlns:w16cex="http://schemas.microsoft.com/office/word/2018/wordml/cex" xmlns:w16cid="http://schemas.microsoft.com/office/word/2016/wordml/cid" xmlns:w16="http://schemas.microsoft.com/office/word/2018/wordml" xmlns:w16du="http://schemas.microsoft.com/office/word/2023/wordml/word16du" xmlns:w16sdtdh="http://schemas.microsoft.com/office/word/2020/wordml/sdtdatahash" xmlns:w16sdtfl="http://schemas.microsoft.com/office/word/2024/wordml/sdtformatlock" xmlns:w16se="http://schemas.microsoft.com/office/word/2015/wordml/symex" xmlns:wpg="http://schemas.microsoft.com/office/word/2010/wordprocessingGroup" xmlns:wpi="http://schemas.microsoft.com/office/word/2010/wordprocessingInk" xmlns:wne="http://schemas.microsoft.com/office/word/2006/wordml" xmlns:wps="http://schemas.microsoft.com/office/word/2010/wordprocessingShape" mc:Ignorable="w14 w15 w16se w16cid w16 w16cex w16sdtdh w16sdtfl w16du wp14">
   <w:body>
+    <w:p>
+      <w:r>
+        <w:t>https://www2.sii.cl/inicio-de-actividades/datos-personales</w:t>
+      </w:r>
+    </w:p>
+    <w:p/>
     <w:p>
       <w:r>
         <w:t>Para activar la aplicación:</w:t>
@@ -52,13 +58,28 @@
     </w:p>
     <w:p/>
     <w:p>
-      <w:r>
-        <w:t>Debo cancelar CANVAS antes del 09/06</w:t>
-      </w:r>
+      <w:hyperlink r:id="rId4" w:history="1">
+        <w:r>
+          <w:rPr>
+            <w:rStyle w:val="Hipervnculo"/>
+          </w:rPr>
+          <w:t>https://github.com/alejandrohenriquezr/Frontend_paw_care2</w:t>
+        </w:r>
+      </w:hyperlink>
+    </w:p>
+    <w:p>
+      <w:hyperlink r:id="rId5" w:history="1">
+        <w:r>
+          <w:rPr>
+            <w:rStyle w:val="Hipervnculo"/>
+          </w:rPr>
+          <w:t>https://console.cloud.google.com/auth/audience?inv=1&amp;invt=Ab2Slg&amp;project=pawcare-543215</w:t>
+        </w:r>
+      </w:hyperlink>
     </w:p>
     <w:p/>
     <w:p>
-      <w:hyperlink r:id="rId4" w:anchor="tarjetas-de-prueba" w:history="1">
+      <w:hyperlink r:id="rId6" w:anchor="tarjetas-de-prueba" w:history="1">
         <w:r>
           <w:rPr>
             <w:rStyle w:val="Hipervnculo"/>
@@ -537,6 +558,12 @@
                 <w:u w:val="single"/>
               </w:rPr>
               <w:br/>
+            </w:r>
+            <w:r>
+              <w:rPr>
+                <w:u w:val="single"/>
+              </w:rPr>
+              <w:lastRenderedPageBreak/>
               <w:t>CVV 123</w:t>
             </w:r>
             <w:r>
@@ -576,6 +603,7 @@
               <w:rPr>
                 <w:u w:val="single"/>
               </w:rPr>
+              <w:lastRenderedPageBreak/>
               <w:t>Genera transacciones </w:t>
             </w:r>
             <w:r>
@@ -625,7 +653,6 @@
               <w:rPr>
                 <w:u w:val="single"/>
               </w:rPr>
-              <w:lastRenderedPageBreak/>
               <w:t>Redcompra</w:t>
             </w:r>
             <w:proofErr w:type="spellEnd"/>
@@ -1853,6 +1880,7 @@
   <w:style w:type="character" w:default="1" w:styleId="Fuentedeprrafopredeter">
     <w:name w:val="Default Paragraph Font"/>
     <w:uiPriority w:val="1"/>
+    <w:semiHidden/>
     <w:unhideWhenUsed/>
   </w:style>
   <w:style w:type="table" w:default="1" w:styleId="Tablanormal">

</xml_diff>

<commit_message>
20250824 Finalizar Pago listo
</commit_message>
<xml_diff>
--- a/notas importantes.docx
+++ b/notas importantes.docx
@@ -55,12 +55,64 @@
     </w:p>
     <w:p>
       <w:r>
-        <w:t xml:space="preserve">Ejecutar la app: </w:t>
-      </w:r>
-      <w:r>
-        <w:t>python app.py</w:t>
+        <w:t xml:space="preserve">Ejecutar la </w:t>
+      </w:r>
+      <w:proofErr w:type="gramStart"/>
+      <w:r>
+        <w:t>app</w:t>
+      </w:r>
+      <w:proofErr w:type="gramEnd"/>
+      <w:r>
+        <w:t xml:space="preserve">: </w:t>
+      </w:r>
+      <w:proofErr w:type="spellStart"/>
+      <w:r>
+        <w:t>python</w:t>
+      </w:r>
+      <w:proofErr w:type="spellEnd"/>
+      <w:r>
+        <w:t xml:space="preserve"> app.py</w:t>
       </w:r>
     </w:p>
+    <w:p>
+      <w:proofErr w:type="spellStart"/>
+      <w:r>
+        <w:t>git</w:t>
+      </w:r>
+      <w:proofErr w:type="spellEnd"/>
+      <w:r>
+        <w:t xml:space="preserve"> </w:t>
+      </w:r>
+      <w:proofErr w:type="spellStart"/>
+      <w:proofErr w:type="gramStart"/>
+      <w:r>
+        <w:t>add</w:t>
+      </w:r>
+      <w:proofErr w:type="spellEnd"/>
+      <w:r>
+        <w:t xml:space="preserve"> .</w:t>
+      </w:r>
+      <w:proofErr w:type="gramEnd"/>
+    </w:p>
+    <w:p>
+      <w:proofErr w:type="spellStart"/>
+      <w:r>
+        <w:t>git</w:t>
+      </w:r>
+      <w:proofErr w:type="spellEnd"/>
+      <w:r>
+        <w:t xml:space="preserve"> </w:t>
+      </w:r>
+      <w:proofErr w:type="spellStart"/>
+      <w:r>
+        <w:t>commit</w:t>
+      </w:r>
+      <w:proofErr w:type="spellEnd"/>
+      <w:r>
+        <w:t xml:space="preserve"> -m "Mensaje descriptivo del cambio"</w:t>
+      </w:r>
+    </w:p>
+    <w:p/>
     <w:p/>
     <w:p>
       <w:hyperlink r:id="rId4" w:history="1">
@@ -465,6 +517,12 @@
                 <w:u w:val="single"/>
               </w:rPr>
               <w:br/>
+            </w:r>
+            <w:r>
+              <w:rPr>
+                <w:u w:val="single"/>
+              </w:rPr>
+              <w:lastRenderedPageBreak/>
               <w:t>CVV 1234</w:t>
             </w:r>
             <w:r>
@@ -504,6 +562,7 @@
               <w:rPr>
                 <w:u w:val="single"/>
               </w:rPr>
+              <w:lastRenderedPageBreak/>
               <w:t>Genera transacciones </w:t>
             </w:r>
             <w:r>
@@ -552,7 +611,6 @@
               <w:rPr>
                 <w:u w:val="single"/>
               </w:rPr>
-              <w:lastRenderedPageBreak/>
               <w:t>MASTERCARD</w:t>
             </w:r>
           </w:p>
@@ -1099,6 +1157,7 @@
               <w:rPr>
                 <w:u w:val="single"/>
               </w:rPr>
+              <w:lastRenderedPageBreak/>
               <w:t>Prepago MASTERCARD</w:t>
             </w:r>
           </w:p>
@@ -1207,7 +1266,6 @@
         <w:rPr>
           <w:u w:val="single"/>
         </w:rPr>
-        <w:lastRenderedPageBreak/>
         <w:t>Cuando aparece un formulario de autenticación con RUT y clave, se debe usar el RUT </w:t>
       </w:r>
       <w:r>

</xml_diff>